<commit_message>
Upgrade Machine Learning internship to the enhanced 180 unique-topic program.
Import the Downloads ML package into the curriculum seed with study notes, instructions, and regenerated day handbooks.

Co-authored-by: Cursor <cursoragent@cursor.com>
</commit_message>
<xml_diff>
--- a/laravel-app/database/data/internship/handbooks/machine_learning/Beyond_ML_Internship_Day_001_Student_Handbook.docx
+++ b/laravel-app/database/data/internship/handbooks/machine_learning/Beyond_ML_Internship_Day_001_Student_Handbook.docx
@@ -38,7 +38,7 @@
           <w:color w:val="1E293B"/>
           <w:sz w:val="28"/>
         </w:rPr>
-        <w:t>Ml Workflow And Environment</w:t>
+        <w:t>ML Workflow and Environment</w:t>
       </w:r>
     </w:p>
     <w:p>
@@ -50,7 +50,7 @@
           <w:b w:val="0"/>
           <w:sz w:val="22"/>
         </w:rPr>
-        <w:t>Orientation and setup. Full student study guide and practical laboratory manual for Beyond Enterprise interns.</w:t>
+        <w:t>Concept study. Full student study guide and practical laboratory manual for Beyond Enterprise interns.</w:t>
       </w:r>
     </w:p>
     <w:tbl>
@@ -141,7 +141,7 @@
               <w:rPr>
                 <w:sz w:val="18"/>
               </w:rPr>
-              <w:t>Orientation and setup</w:t>
+              <w:t>Concept study</w:t>
             </w:r>
           </w:p>
         </w:tc>
@@ -167,7 +167,7 @@
               <w:rPr>
                 <w:sz w:val="18"/>
               </w:rPr>
-              <w:t>8 hours</w:t>
+              <w:t>8.0 hours</w:t>
             </w:r>
           </w:p>
         </w:tc>
@@ -180,7 +180,7 @@
               <w:rPr>
                 <w:sz w:val="18"/>
               </w:rPr>
-              <w:t>Python, Jupyter, pandas and scikit-learn on a laptop</w:t>
+              <w:t>Python, Jupyter, pandas, scikit-learn</w:t>
             </w:r>
           </w:p>
         </w:tc>
@@ -198,7 +198,7 @@
           <w:color w:val="0B3F90"/>
           <w:sz w:val="20"/>
         </w:rPr>
-        <w:t>Day 1 objective  Complete the orientation and setup for Ml Workflow And Environment: Apply ML workflow and environment safely and explain the result in a professional technical report.</w:t>
+        <w:t>Day 1 objective  Complete the concept study for ML Workflow and Environment: Configure and verify an approved Python, Jupyter, pandas, and scikit-learn environment; create a reproducible project structure; run a synthetic-data baseline; and prove honest train/test separation.</w:t>
       </w:r>
     </w:p>
     <w:p>
@@ -256,7 +256,7 @@
           <w:b w:val="0"/>
           <w:sz w:val="22"/>
         </w:rPr>
-        <w:t>Submit: A setup screenshot, a short explanation of the key terms, and a safety/ethics check..</w:t>
+        <w:t>Submit: Baseline screenshot, reproducible project, evaluation evidence, independent verification, responsible-ML check, and professional report..</w:t>
       </w:r>
     </w:p>
     <w:p>
@@ -350,7 +350,7 @@
               <w:rPr>
                 <w:sz w:val="18"/>
               </w:rPr>
-              <w:t>0:00–0:25</w:t>
+              <w:t>0:00–0:30</w:t>
             </w:r>
           </w:p>
         </w:tc>
@@ -363,7 +363,7 @@
               <w:rPr>
                 <w:sz w:val="18"/>
               </w:rPr>
-              <w:t>Review prior day + authorization checklist</w:t>
+              <w:t>Assessment brief + rubric review</w:t>
             </w:r>
           </w:p>
         </w:tc>
@@ -376,7 +376,7 @@
               <w:rPr>
                 <w:sz w:val="18"/>
               </w:rPr>
-              <w:t>Signed pre-flight</w:t>
+              <w:t>Plan</w:t>
             </w:r>
           </w:p>
         </w:tc>
@@ -391,7 +391,7 @@
               <w:rPr>
                 <w:sz w:val="18"/>
               </w:rPr>
-              <w:t>0:25–1:10</w:t>
+              <w:t>0:30–2:30</w:t>
             </w:r>
           </w:p>
         </w:tc>
@@ -404,7 +404,7 @@
               <w:rPr>
                 <w:sz w:val="18"/>
               </w:rPr>
-              <w:t>Concept study for today's topic</w:t>
+              <w:t>End-to-end demonstration</w:t>
             </w:r>
           </w:p>
         </w:tc>
@@ -417,7 +417,7 @@
               <w:rPr>
                 <w:sz w:val="18"/>
               </w:rPr>
-              <w:t>Concept notes</w:t>
+              <w:t>Demo evidence</w:t>
             </w:r>
           </w:p>
         </w:tc>
@@ -432,48 +432,7 @@
               <w:rPr>
                 <w:sz w:val="18"/>
               </w:rPr>
-              <w:t>1:10–2:40</w:t>
-            </w:r>
-          </w:p>
-        </w:tc>
-        <w:tc>
-          <w:tcPr>
-            <w:tcW w:type="dxa" w:w="3408"/>
-          </w:tcPr>
-          <w:p>
-            <w:r>
-              <w:rPr>
-                <w:sz w:val="18"/>
-              </w:rPr>
-              <w:t>Environment verify / light setup lab</w:t>
-            </w:r>
-          </w:p>
-        </w:tc>
-        <w:tc>
-          <w:tcPr>
-            <w:tcW w:type="dxa" w:w="3408"/>
-          </w:tcPr>
-          <w:p>
-            <w:r>
-              <w:rPr>
-                <w:sz w:val="18"/>
-              </w:rPr>
-              <w:t>Working baseline</w:t>
-            </w:r>
-          </w:p>
-        </w:tc>
-      </w:tr>
-      <w:tr>
-        <w:tc>
-          <w:tcPr>
-            <w:tcW w:type="dxa" w:w="3408"/>
-          </w:tcPr>
-          <w:p>
-            <w:r>
-              <w:rPr>
-                <w:sz w:val="18"/>
-              </w:rPr>
-              <w:t>2:40–2:55</w:t>
+              <w:t>2:30–2:45</w:t>
             </w:r>
           </w:p>
         </w:tc>
@@ -514,7 +473,7 @@
               <w:rPr>
                 <w:sz w:val="18"/>
               </w:rPr>
-              <w:t>2:55–4:40</w:t>
+              <w:t>2:45–4:15</w:t>
             </w:r>
           </w:p>
         </w:tc>
@@ -527,7 +486,7 @@
               <w:rPr>
                 <w:sz w:val="18"/>
               </w:rPr>
-              <w:t>Guided mini-exercise + expected checks</w:t>
+              <w:t>Self-score against rubric</w:t>
             </w:r>
           </w:p>
         </w:tc>
@@ -540,7 +499,7 @@
               <w:rPr>
                 <w:sz w:val="18"/>
               </w:rPr>
-              <w:t>First evidence</w:t>
+              <w:t>Self-score sheet</w:t>
             </w:r>
           </w:p>
         </w:tc>
@@ -555,7 +514,7 @@
               <w:rPr>
                 <w:sz w:val="18"/>
               </w:rPr>
-              <w:t>4:40–4:55</w:t>
+              <w:t>4:15–5:45</w:t>
             </w:r>
           </w:p>
         </w:tc>
@@ -568,7 +527,7 @@
               <w:rPr>
                 <w:sz w:val="18"/>
               </w:rPr>
-              <w:t>Break</w:t>
+              <w:t>Reflection: wins, failures, next steps</w:t>
             </w:r>
           </w:p>
         </w:tc>
@@ -581,7 +540,7 @@
               <w:rPr>
                 <w:sz w:val="18"/>
               </w:rPr>
-              <w:t>—</w:t>
+              <w:t>Reflection</w:t>
             </w:r>
           </w:p>
         </w:tc>
@@ -596,7 +555,7 @@
               <w:rPr>
                 <w:sz w:val="18"/>
               </w:rPr>
-              <w:t>4:55–6:25</w:t>
+              <w:t>5:45–8:00</w:t>
             </w:r>
           </w:p>
         </w:tc>
@@ -609,7 +568,7 @@
               <w:rPr>
                 <w:sz w:val="18"/>
               </w:rPr>
-              <w:t>Verification + troubleshooting notes</w:t>
+              <w:t>Final evidence pack + report</w:t>
             </w:r>
           </w:p>
         </w:tc>
@@ -622,48 +581,7 @@
               <w:rPr>
                 <w:sz w:val="18"/>
               </w:rPr>
-              <w:t>Rerun proof</w:t>
-            </w:r>
-          </w:p>
-        </w:tc>
-      </w:tr>
-      <w:tr>
-        <w:tc>
-          <w:tcPr>
-            <w:tcW w:type="dxa" w:w="3408"/>
-          </w:tcPr>
-          <w:p>
-            <w:r>
-              <w:rPr>
-                <w:sz w:val="18"/>
-              </w:rPr>
-              <w:t>6:25–8:00</w:t>
-            </w:r>
-          </w:p>
-        </w:tc>
-        <w:tc>
-          <w:tcPr>
-            <w:tcW w:type="dxa" w:w="3408"/>
-          </w:tcPr>
-          <w:p>
-            <w:r>
-              <w:rPr>
-                <w:sz w:val="18"/>
-              </w:rPr>
-              <w:t>Evidence pack + report draft</w:t>
-            </w:r>
-          </w:p>
-        </w:tc>
-        <w:tc>
-          <w:tcPr>
-            <w:tcW w:type="dxa" w:w="3408"/>
-          </w:tcPr>
-          <w:p>
-            <w:r>
-              <w:rPr>
-                <w:sz w:val="18"/>
-              </w:rPr>
-              <w:t>Submission draft</w:t>
+              <w:t>Submission</w:t>
             </w:r>
           </w:p>
         </w:tc>
@@ -687,7 +605,7 @@
           <w:b w:val="0"/>
           <w:sz w:val="20"/>
         </w:rPr>
-        <w:t>Curriculum objective (source of truth): Apply ML workflow and environment safely and explain the result in a professional technical report.</w:t>
+        <w:t>Curriculum objective (source of truth): Configure and verify an approved Python, Jupyter, pandas, and scikit-learn environment; create a reproducible project structure; run a synthetic-data baseline; and prove honest train/test separation.</w:t>
       </w:r>
     </w:p>
     <w:p>
@@ -699,7 +617,7 @@
           <w:b w:val="0"/>
           <w:sz w:val="22"/>
         </w:rPr>
-        <w:t>Explain Ml Workflow And Environment to a supervisor in under two minutes.</w:t>
+        <w:t>Explain ML Workflow and Environment to a supervisor in under two minutes.</w:t>
       </w:r>
     </w:p>
     <w:p>
@@ -711,7 +629,7 @@
           <w:b w:val="0"/>
           <w:sz w:val="22"/>
         </w:rPr>
-        <w:t>Configure or verify the approved tools required for Ml Workflow And Environment.</w:t>
+        <w:t>Configure or verify the approved tools required for ML Workflow and Environment.</w:t>
       </w:r>
     </w:p>
     <w:p>
@@ -723,7 +641,7 @@
           <w:b w:val="0"/>
           <w:sz w:val="22"/>
         </w:rPr>
-        <w:t>Implement or perform the orientation and setup practical for this topic.</w:t>
+        <w:t>Implement or perform the concept study practical for this topic.</w:t>
       </w:r>
     </w:p>
     <w:p>
@@ -779,7 +697,7 @@
           <w:b w:val="0"/>
           <w:sz w:val="22"/>
         </w:rPr>
-        <w:t>Define the professional meaning of “Ml Workflow And Environment” before you use tools. Do not split the title into meaningless words. Connect each concept to today's practical action.</w:t>
+        <w:t>Define the professional meaning of “ML Workflow and Environment” before you use tools. Do not split the title into meaningless words. Connect each concept to today's practical action.</w:t>
       </w:r>
     </w:p>
     <w:tbl>
@@ -900,7 +818,7 @@
               <w:rPr>
                 <w:sz w:val="18"/>
               </w:rPr>
-              <w:t>Professional practice for Ml Workflow And Environment</w:t>
+              <w:t>Professional practice for ML Workflow and Environment</w:t>
             </w:r>
           </w:p>
         </w:tc>
@@ -1334,7 +1252,7 @@
           <w:b w:val="0"/>
           <w:sz w:val="22"/>
         </w:rPr>
-        <w:t>Tools available: Python, Jupyter, pandas and scikit-learn on a laptop.</w:t>
+        <w:t>Tools available: Python, Jupyter, pandas, scikit-learn.</w:t>
       </w:r>
     </w:p>
     <w:p>
@@ -1663,7 +1581,7 @@
           <w:b w:val="0"/>
           <w:sz w:val="18"/>
         </w:rPr>
-        <w:t>└── Day_01_Ml_Workflow_And_Environment/</w:t>
+        <w:t>└── Day_01_ML_Workflow_and_Environment/</w:t>
       </w:r>
     </w:p>
     <w:p>
@@ -1816,7 +1734,7 @@
           <w:b w:val="0"/>
           <w:sz w:val="18"/>
         </w:rPr>
-        <w:t>mkdir Beyond_ML_Internship\Day_01_Ml_Workflow_And_Environment\evidence, Beyond_ML_Internship\Day_01_Ml_Workflow_And_Environment\notebooks, Beyond_ML_Internship\Day_01_Ml_Workflow_And_Environment\src, Beyond_ML_Internship\Day_01_Ml_Workflow_And_Environment\data, Beyond_ML_Internship\Day_01_Ml_Workflow_And_Environment\output, Beyond_ML_Internship\Day_01_Ml_Workflow_And_Environment\report -Force</w:t>
+        <w:t>mkdir Beyond_ML_Internship\Day_01_ML_Workflow_and_Environment\evidence, Beyond_ML_Internship\Day_01_ML_Workflow_and_Environment\notebooks, Beyond_ML_Internship\Day_01_ML_Workflow_and_Environment\src, Beyond_ML_Internship\Day_01_ML_Workflow_and_Environment\data, Beyond_ML_Internship\Day_01_ML_Workflow_and_Environment\output, Beyond_ML_Internship\Day_01_ML_Workflow_and_Environment\report -Force</w:t>
       </w:r>
     </w:p>
     <w:p/>
@@ -1857,7 +1775,7 @@
           <w:b w:val="0"/>
           <w:sz w:val="18"/>
         </w:rPr>
-        <w:t>mkdir -p Beyond_ML_Internship/Day_01_Ml_Workflow_And_Environment/{evidence,notebooks,src,data,output,report}</w:t>
+        <w:t>mkdir -p Beyond_ML_Internship/Day_01_ML_Workflow_and_Environment/{evidence,notebooks,src,data,output,report}</w:t>
       </w:r>
     </w:p>
     <w:p/>
@@ -1973,7 +1891,7 @@
           <w:color w:val="0B3F90"/>
           <w:sz w:val="24"/>
         </w:rPr>
-        <w:t>Orientation and setup: Ml Workflow And Environment</w:t>
+        <w:t>Concept study: ML Workflow and Environment</w:t>
       </w:r>
     </w:p>
     <w:p>
@@ -1997,7 +1915,7 @@
           <w:b w:val="0"/>
           <w:sz w:val="20"/>
         </w:rPr>
-        <w:t>• Read the Study Notes on this page, then create or verify the lab needed for ML workflow and environment.</w:t>
+        <w:t>• Confirm the written objective, authorized dataset, licence, privacy classification, computing boundary, supervisor approvals, and stop conditions.</w:t>
       </w:r>
     </w:p>
     <w:p>
@@ -2009,7 +1927,7 @@
           <w:b w:val="0"/>
           <w:sz w:val="20"/>
         </w:rPr>
-        <w:t>• Work only in an authorized lab, VM or on equipment assigned by Beyond.</w:t>
+        <w:t>• Create the day folder with data/raw, data/processed, notebooks, src, tests, models, output, evidence, and report; never overwrite prior evidence.</w:t>
       </w:r>
     </w:p>
     <w:p>
@@ -2021,7 +1939,79 @@
           <w:b w:val="0"/>
           <w:sz w:val="20"/>
         </w:rPr>
-        <w:t>• Keep time entries truthful and ask the supervisor before changing production equipment.</w:t>
+        <w:t>• Record OS, Python, package, seed, dataset version/hash, hardware, and tools: Python, Jupyter, pandas, scikit-learn.</w:t>
+      </w:r>
+    </w:p>
+    <w:p>
+      <w:pPr>
+        <w:spacing w:after="120"/>
+      </w:pPr>
+      <w:r>
+        <w:rPr>
+          <w:b w:val="0"/>
+          <w:sz w:val="20"/>
+        </w:rPr>
+        <w:t>• Frame the prediction or analysis task, target population, features, label, intended user, baseline, metric, acceptance threshold, and harmful misuse to avoid.</w:t>
+      </w:r>
+    </w:p>
+    <w:p>
+      <w:pPr>
+        <w:spacing w:after="120"/>
+      </w:pPr>
+      <w:r>
+        <w:rPr>
+          <w:b w:val="0"/>
+          <w:sz w:val="20"/>
+        </w:rPr>
+        <w:t>• Inspect data quality before modeling; check schema, missingness, duplicates, ranges, imbalance, representativeness, provenance, and leakage risks.</w:t>
+      </w:r>
+    </w:p>
+    <w:p>
+      <w:pPr>
+        <w:spacing w:after="120"/>
+      </w:pPr>
+      <w:r>
+        <w:rPr>
+          <w:b w:val="0"/>
+          <w:sz w:val="20"/>
+        </w:rPr>
+        <w:t>• Implement the practical objective: Configure and verify an approved Python, Jupyter, pandas, and scikit-learn environment; create a reproducible project structure; run a synthetic-data baseline; and prove honest train/test separation.</w:t>
+      </w:r>
+    </w:p>
+    <w:p>
+      <w:pPr>
+        <w:spacing w:after="120"/>
+      </w:pPr>
+      <w:r>
+        <w:rPr>
+          <w:b w:val="0"/>
+          <w:sz w:val="20"/>
+        </w:rPr>
+        <w:t>• Evaluate on untouched validation/test data with appropriate metrics, slice analysis, errors, uncertainty, and comparison to the baseline or heuristic.</w:t>
+      </w:r>
+    </w:p>
+    <w:p>
+      <w:pPr>
+        <w:spacing w:after="120"/>
+      </w:pPr>
+      <w:r>
+        <w:rPr>
+          <w:b w:val="0"/>
+          <w:sz w:val="20"/>
+        </w:rPr>
+        <w:t>• Independently verify by a clean rerun from saved dependencies and seeds plus a unit test, alternate calculation, peer review, or supervisor check.</w:t>
+      </w:r>
+    </w:p>
+    <w:p>
+      <w:pPr>
+        <w:spacing w:after="120"/>
+      </w:pPr>
+      <w:r>
+        <w:rPr>
+          <w:b w:val="0"/>
+          <w:sz w:val="20"/>
+        </w:rPr>
+        <w:t>• Save privacy-reviewed evidence, model/data documentation, troubleshooting, limitations, restoration/cleanup record, and an honest AI/tool-assistance disclosure.</w:t>
       </w:r>
     </w:p>
     <w:p>
@@ -2047,7 +2037,7 @@
           <w:b w:val="0"/>
           <w:sz w:val="18"/>
         </w:rPr>
-        <w:t># day_01_lab.py — Orientation and setup: Ml Workflow And Environment</w:t>
+        <w:t># day_01_lab.py — Concept study: ML Workflow and Environment</w:t>
       </w:r>
     </w:p>
     <w:p>
@@ -2089,7 +2079,7 @@
           <w:b w:val="0"/>
           <w:sz w:val="18"/>
         </w:rPr>
-        <w:t>"""Day 1 practical starter for Ml Workflow And Environment.</w:t>
+        <w:t>"""Day 1 practical starter for ML Workflow and Environment.</w:t>
       </w:r>
     </w:p>
     <w:p>
@@ -2271,7 +2261,7 @@
           <w:b w:val="0"/>
           <w:sz w:val="18"/>
         </w:rPr>
-        <w:t xml:space="preserve">    print("Program topic:", 'Ml Workflow And Environment')</w:t>
+        <w:t xml:space="preserve">    print("Program topic:", 'ML Workflow and Environment')</w:t>
       </w:r>
     </w:p>
     <w:p>
@@ -2285,7 +2275,7 @@
           <w:b w:val="0"/>
           <w:sz w:val="18"/>
         </w:rPr>
-        <w:t xml:space="preserve">    print("Day mode:", 'Orientation and setup')</w:t>
+        <w:t xml:space="preserve">    print("Day mode:", 'Concept study')</w:t>
       </w:r>
     </w:p>
     <w:p>
@@ -5890,7 +5880,7 @@
           <w:b w:val="0"/>
           <w:sz w:val="22"/>
         </w:rPr>
-        <w:t>Objective addressed for Ml Workflow And Environment</w:t>
+        <w:t>Objective addressed for ML Workflow and Environment</w:t>
       </w:r>
     </w:p>
     <w:p>
@@ -5902,7 +5892,7 @@
           <w:b w:val="0"/>
           <w:sz w:val="22"/>
         </w:rPr>
-        <w:t>Orientation and setup practical completed</w:t>
+        <w:t>Concept study practical completed</w:t>
       </w:r>
     </w:p>
     <w:p>
@@ -5994,7 +5984,7 @@
           <w:b w:val="0"/>
           <w:sz w:val="22"/>
         </w:rPr>
-        <w:t>Matches: A setup screenshot, a short explanation of the key terms, and a safety/ethics check.</w:t>
+        <w:t>Matches: Baseline screenshot, reproducible project, evaluation evidence, independent verification, responsible-ML check, and professional report.</w:t>
       </w:r>
     </w:p>
     <w:p>
@@ -6026,7 +6016,7 @@
           <w:b w:val="0"/>
           <w:sz w:val="22"/>
         </w:rPr>
-        <w:t>Explain Ml Workflow And Environment without reading.</w:t>
+        <w:t>Explain ML Workflow and Environment without reading.</w:t>
       </w:r>
     </w:p>
     <w:p>
@@ -6118,7 +6108,7 @@
           <w:b w:val="0"/>
           <w:sz w:val="22"/>
         </w:rPr>
-        <w:t>Today is Day 1 (Orientation and setup) on Ml Workflow And Environment. I worked only in the authorized Beyond ML / data science lab. I completed the practical objective, verified with a second check, and packaged evidence. Main risk: unauthorized or unsafe action; control: checklist + supervisor escalation. Limitation: classroom/lab scope only. Next: continue the topic cycle and keep documentation reproducible.</w:t>
+        <w:t>Today is Day 1 (Concept study) on ML Workflow and Environment. I worked only in the authorized Beyond ML / data science lab. I completed the practical objective, verified with a second check, and packaged evidence. Main risk: unauthorized or unsafe action; control: checklist + supervisor escalation. Limitation: classroom/lab scope only. Next: continue the topic cycle and keep documentation reproducible.</w:t>
       </w:r>
     </w:p>
     <w:p>

</xml_diff>